<commit_message>
Continue the Pyrat thm ctf
</commit_message>
<xml_diff>
--- a/THM_challenges/Easy/Pyrat/Pyrat_Solution_Documentation.docx
+++ b/THM_challenges/Easy/Pyrat/Pyrat_Solution_Documentation.docx
@@ -119,6 +119,9 @@
     </w:p>
     <w:p>
       <w:r>
+        <w:rPr>
+          <w:noProof/>
+        </w:rPr>
         <w:drawing>
           <wp:inline distT="0" distB="0" distL="0" distR="0" wp14:anchorId="10945BB1" wp14:editId="324AEE50">
             <wp:extent cx="7556500" cy="4551680"/>
@@ -196,6 +199,9 @@
     </w:p>
     <w:p>
       <w:r>
+        <w:rPr>
+          <w:noProof/>
+        </w:rPr>
         <w:drawing>
           <wp:inline distT="0" distB="0" distL="0" distR="0" wp14:anchorId="7A87287D" wp14:editId="4FAD281A">
             <wp:extent cx="3696020" cy="1066892"/>
@@ -247,96 +253,693 @@
         <w:t>another way of connecti</w:t>
       </w:r>
       <w:r>
-        <w:t xml:space="preserve">on. I looked again </w:t>
-      </w:r>
-      <w:r>
-        <w:t>at</w:t>
-      </w:r>
-      <w:r>
-        <w:t xml:space="preserve"> the Nmap results</w:t>
-      </w:r>
-      <w:r>
-        <w:t xml:space="preserve"> and </w:t>
-      </w:r>
-      <w:r>
-        <w:t>found that th</w:t>
-      </w:r>
-      <w:r>
-        <w:t xml:space="preserve">e target </w:t>
-      </w:r>
-      <w:r>
-        <w:t>has</w:t>
-      </w:r>
-      <w:r>
-        <w:t xml:space="preserve"> a Python SimpleHTTP </w:t>
-      </w:r>
-      <w:r>
-        <w:t>module ve</w:t>
-      </w:r>
-      <w:r>
-        <w:t>r</w:t>
-      </w:r>
-      <w:r>
-        <w:t>sion is 0.6</w:t>
-      </w:r>
-      <w:r>
-        <w:t>. This version is vulnerable to</w:t>
-      </w:r>
-      <w:r>
-        <w:t xml:space="preserve"> the </w:t>
-      </w:r>
-      <w:r>
-        <w:t>vulnerable</w:t>
-      </w:r>
-      <w:r>
-        <w:t xml:space="preserve"> to</w:t>
-      </w:r>
-      <w:r>
-        <w:t xml:space="preserve"> </w:t>
-      </w:r>
-      <w:r>
-        <w:t>CVE-2022-35411</w:t>
-      </w:r>
-      <w:r>
-        <w:t xml:space="preserve">. This </w:t>
-      </w:r>
-      <w:r>
-        <w:t xml:space="preserve">allows us to exploit </w:t>
-      </w:r>
-      <w:r>
-        <w:t>Remote Code Execution</w:t>
-      </w:r>
-      <w:r>
-        <w:t xml:space="preserve"> </w:t>
-      </w:r>
-      <w:r>
-        <w:t>using pickle.</w:t>
-      </w:r>
-    </w:p>
-    <w:p>
-      <w:r>
-        <w:br w:type="page"/>
-      </w:r>
-    </w:p>
-    <w:p>
-      <w:r>
-        <w:lastRenderedPageBreak/>
-        <w:t>I found on GitHub th</w:t>
-      </w:r>
-      <w:r>
-        <w:t xml:space="preserve">is </w:t>
-      </w:r>
-      <w:r>
-        <w:t xml:space="preserve">exploit to the vulnerability: </w:t>
-      </w:r>
-      <w:hyperlink r:id="rId6" w:history="1">
+        <w:t xml:space="preserve">on. </w:t>
+      </w:r>
+      <w:r>
+        <w:t xml:space="preserve">I moved to </w:t>
+      </w:r>
+      <w:r>
+        <w:t>connect to the target using Netcat</w:t>
+      </w:r>
+      <w:r>
+        <w:t>:</w:t>
+      </w:r>
+    </w:p>
+    <w:p>
+      <w:r>
+        <w:drawing>
+          <wp:inline distT="0" distB="0" distL="0" distR="0" wp14:anchorId="39495C0A" wp14:editId="5544C4D4">
+            <wp:extent cx="1409822" cy="502964"/>
+            <wp:effectExtent l="0" t="0" r="0" b="0"/>
+            <wp:docPr id="93662947" name="תמונה 1" descr="תמונה שמכילה טקסט, גופן, צילום מסך, מספר&#10;&#10;תוכן בינה מלאכותית גנרטיבית עשוי להיות שגוי."/>
+            <wp:cNvGraphicFramePr>
+              <a:graphicFrameLocks xmlns:a="http://schemas.openxmlformats.org/drawingml/2006/main" noChangeAspect="1"/>
+            </wp:cNvGraphicFramePr>
+            <a:graphic xmlns:a="http://schemas.openxmlformats.org/drawingml/2006/main">
+              <a:graphicData uri="http://schemas.openxmlformats.org/drawingml/2006/picture">
+                <pic:pic xmlns:pic="http://schemas.openxmlformats.org/drawingml/2006/picture">
+                  <pic:nvPicPr>
+                    <pic:cNvPr id="93662947" name="תמונה 1" descr="תמונה שמכילה טקסט, גופן, צילום מסך, מספר&#10;&#10;תוכן בינה מלאכותית גנרטיבית עשוי להיות שגוי."/>
+                    <pic:cNvPicPr/>
+                  </pic:nvPicPr>
+                  <pic:blipFill>
+                    <a:blip r:embed="rId6"/>
+                    <a:stretch>
+                      <a:fillRect/>
+                    </a:stretch>
+                  </pic:blipFill>
+                  <pic:spPr>
+                    <a:xfrm>
+                      <a:off x="0" y="0"/>
+                      <a:ext cx="1409822" cy="502964"/>
+                    </a:xfrm>
+                    <a:prstGeom prst="rect">
+                      <a:avLst/>
+                    </a:prstGeom>
+                  </pic:spPr>
+                </pic:pic>
+              </a:graphicData>
+            </a:graphic>
+          </wp:inline>
+        </w:drawing>
+      </w:r>
+    </w:p>
+    <w:p>
+      <w:r>
+        <w:t xml:space="preserve">I tried to enter ‘a’ and I got this error. This error comes from python </w:t>
+      </w:r>
+      <w:r>
+        <w:t xml:space="preserve">interpreter, </w:t>
+      </w:r>
+      <w:r>
+        <w:t xml:space="preserve">so it probably </w:t>
+      </w:r>
+      <w:proofErr w:type="gramStart"/>
+      <w:r>
+        <w:t>try</w:t>
+      </w:r>
+      <w:proofErr w:type="gramEnd"/>
+      <w:r>
+        <w:t xml:space="preserve"> to </w:t>
+      </w:r>
+      <w:r>
+        <w:t xml:space="preserve">execute </w:t>
+      </w:r>
+      <w:r>
+        <w:t>my input</w:t>
+      </w:r>
+      <w:r>
+        <w:t>.</w:t>
+      </w:r>
+      <w:r>
+        <w:t xml:space="preserve"> I tested this assumption with a real python command:</w:t>
+      </w:r>
+    </w:p>
+    <w:p>
+      <w:r>
+        <w:drawing>
+          <wp:inline distT="0" distB="0" distL="0" distR="0" wp14:anchorId="66CB29FB" wp14:editId="1B16707B">
+            <wp:extent cx="1169771" cy="266723"/>
+            <wp:effectExtent l="0" t="0" r="0" b="0"/>
+            <wp:docPr id="1881800456" name="תמונה 1"/>
+            <wp:cNvGraphicFramePr>
+              <a:graphicFrameLocks xmlns:a="http://schemas.openxmlformats.org/drawingml/2006/main" noChangeAspect="1"/>
+            </wp:cNvGraphicFramePr>
+            <a:graphic xmlns:a="http://schemas.openxmlformats.org/drawingml/2006/main">
+              <a:graphicData uri="http://schemas.openxmlformats.org/drawingml/2006/picture">
+                <pic:pic xmlns:pic="http://schemas.openxmlformats.org/drawingml/2006/picture">
+                  <pic:nvPicPr>
+                    <pic:cNvPr id="1881800456" name=""/>
+                    <pic:cNvPicPr/>
+                  </pic:nvPicPr>
+                  <pic:blipFill>
+                    <a:blip r:embed="rId7"/>
+                    <a:stretch>
+                      <a:fillRect/>
+                    </a:stretch>
+                  </pic:blipFill>
+                  <pic:spPr>
+                    <a:xfrm>
+                      <a:off x="0" y="0"/>
+                      <a:ext cx="1169771" cy="266723"/>
+                    </a:xfrm>
+                    <a:prstGeom prst="rect">
+                      <a:avLst/>
+                    </a:prstGeom>
+                  </pic:spPr>
+                </pic:pic>
+              </a:graphicData>
+            </a:graphic>
+          </wp:inline>
+        </w:drawing>
+      </w:r>
+    </w:p>
+    <w:p>
+      <w:r>
+        <w:t>And I found out that it actually works!</w:t>
+      </w:r>
+      <w:r>
+        <w:t xml:space="preserve"> Then I </w:t>
+      </w:r>
+      <w:r>
+        <w:t>entered this python command to execute a Netcat reverse shell</w:t>
+      </w:r>
+      <w:r>
+        <w:t xml:space="preserve"> (I found it on </w:t>
+      </w:r>
+      <w:hyperlink r:id="rId8" w:history="1">
         <w:r>
           <w:rPr>
             <w:rStyle w:val="Hyperlink"/>
           </w:rPr>
-          <w:t>https://github.com/fuzzlove/CVE-2022-35411/blob/main/rpc-exploit.py</w:t>
+          <w:t>reverse shell generator</w:t>
         </w:r>
       </w:hyperlink>
+      <w:r>
+        <w:t>)</w:t>
+      </w:r>
+      <w:r>
+        <w:t>:</w:t>
+      </w:r>
+    </w:p>
+    <w:p>
+      <w:r>
+        <w:lastRenderedPageBreak/>
+        <w:drawing>
+          <wp:inline distT="0" distB="0" distL="0" distR="0" wp14:anchorId="563E505D" wp14:editId="2F9DD9DA">
+            <wp:extent cx="7132938" cy="502964"/>
+            <wp:effectExtent l="0" t="0" r="0" b="0"/>
+            <wp:docPr id="570456891" name="תמונה 1"/>
+            <wp:cNvGraphicFramePr>
+              <a:graphicFrameLocks xmlns:a="http://schemas.openxmlformats.org/drawingml/2006/main" noChangeAspect="1"/>
+            </wp:cNvGraphicFramePr>
+            <a:graphic xmlns:a="http://schemas.openxmlformats.org/drawingml/2006/main">
+              <a:graphicData uri="http://schemas.openxmlformats.org/drawingml/2006/picture">
+                <pic:pic xmlns:pic="http://schemas.openxmlformats.org/drawingml/2006/picture">
+                  <pic:nvPicPr>
+                    <pic:cNvPr id="570456891" name=""/>
+                    <pic:cNvPicPr/>
+                  </pic:nvPicPr>
+                  <pic:blipFill>
+                    <a:blip r:embed="rId9"/>
+                    <a:stretch>
+                      <a:fillRect/>
+                    </a:stretch>
+                  </pic:blipFill>
+                  <pic:spPr>
+                    <a:xfrm>
+                      <a:off x="0" y="0"/>
+                      <a:ext cx="7132938" cy="502964"/>
+                    </a:xfrm>
+                    <a:prstGeom prst="rect">
+                      <a:avLst/>
+                    </a:prstGeom>
+                  </pic:spPr>
+                </pic:pic>
+              </a:graphicData>
+            </a:graphic>
+          </wp:inline>
+        </w:drawing>
+      </w:r>
+    </w:p>
+    <w:p>
+      <w:r>
+        <w:t xml:space="preserve">But before that I </w:t>
+      </w:r>
+      <w:r>
+        <w:t>established</w:t>
+      </w:r>
+      <w:r>
+        <w:t xml:space="preserve"> a Netcat listener:</w:t>
+      </w:r>
+    </w:p>
+    <w:p>
+      <w:r>
+        <w:drawing>
+          <wp:inline distT="0" distB="0" distL="0" distR="0" wp14:anchorId="7CEAADAD" wp14:editId="5215AF92">
+            <wp:extent cx="1531753" cy="400085"/>
+            <wp:effectExtent l="0" t="0" r="0" b="0"/>
+            <wp:docPr id="1039264331" name="תמונה 1"/>
+            <wp:cNvGraphicFramePr>
+              <a:graphicFrameLocks xmlns:a="http://schemas.openxmlformats.org/drawingml/2006/main" noChangeAspect="1"/>
+            </wp:cNvGraphicFramePr>
+            <a:graphic xmlns:a="http://schemas.openxmlformats.org/drawingml/2006/main">
+              <a:graphicData uri="http://schemas.openxmlformats.org/drawingml/2006/picture">
+                <pic:pic xmlns:pic="http://schemas.openxmlformats.org/drawingml/2006/picture">
+                  <pic:nvPicPr>
+                    <pic:cNvPr id="1039264331" name=""/>
+                    <pic:cNvPicPr/>
+                  </pic:nvPicPr>
+                  <pic:blipFill>
+                    <a:blip r:embed="rId10"/>
+                    <a:stretch>
+                      <a:fillRect/>
+                    </a:stretch>
+                  </pic:blipFill>
+                  <pic:spPr>
+                    <a:xfrm>
+                      <a:off x="0" y="0"/>
+                      <a:ext cx="1531753" cy="400085"/>
+                    </a:xfrm>
+                    <a:prstGeom prst="rect">
+                      <a:avLst/>
+                    </a:prstGeom>
+                  </pic:spPr>
+                </pic:pic>
+              </a:graphicData>
+            </a:graphic>
+          </wp:inline>
+        </w:drawing>
+      </w:r>
+    </w:p>
+    <w:p>
+      <w:r>
+        <w:t>And I got a shell:</w:t>
+      </w:r>
+    </w:p>
+    <w:p>
+      <w:r>
+        <w:drawing>
+          <wp:inline distT="0" distB="0" distL="0" distR="0" wp14:anchorId="5CAD0723" wp14:editId="74F7A3DA">
+            <wp:extent cx="3600762" cy="331499"/>
+            <wp:effectExtent l="0" t="0" r="0" b="0"/>
+            <wp:docPr id="701635430" name="תמונה 1"/>
+            <wp:cNvGraphicFramePr>
+              <a:graphicFrameLocks xmlns:a="http://schemas.openxmlformats.org/drawingml/2006/main" noChangeAspect="1"/>
+            </wp:cNvGraphicFramePr>
+            <a:graphic xmlns:a="http://schemas.openxmlformats.org/drawingml/2006/main">
+              <a:graphicData uri="http://schemas.openxmlformats.org/drawingml/2006/picture">
+                <pic:pic xmlns:pic="http://schemas.openxmlformats.org/drawingml/2006/picture">
+                  <pic:nvPicPr>
+                    <pic:cNvPr id="701635430" name=""/>
+                    <pic:cNvPicPr/>
+                  </pic:nvPicPr>
+                  <pic:blipFill>
+                    <a:blip r:embed="rId11"/>
+                    <a:stretch>
+                      <a:fillRect/>
+                    </a:stretch>
+                  </pic:blipFill>
+                  <pic:spPr>
+                    <a:xfrm>
+                      <a:off x="0" y="0"/>
+                      <a:ext cx="3600762" cy="331499"/>
+                    </a:xfrm>
+                    <a:prstGeom prst="rect">
+                      <a:avLst/>
+                    </a:prstGeom>
+                  </pic:spPr>
+                </pic:pic>
+              </a:graphicData>
+            </a:graphic>
+          </wp:inline>
+        </w:drawing>
+      </w:r>
+    </w:p>
+    <w:p>
+      <w:r>
+        <w:t xml:space="preserve">I run </w:t>
+      </w:r>
+      <w:r>
+        <w:t xml:space="preserve">whoami and id commands to check </w:t>
+      </w:r>
+      <w:r>
+        <w:t>who am I</w:t>
+      </w:r>
+      <w:r>
+        <w:t>:</w:t>
+      </w:r>
+    </w:p>
+    <w:p>
+      <w:r>
+        <w:drawing>
+          <wp:inline distT="0" distB="0" distL="0" distR="0" wp14:anchorId="7C9F8166" wp14:editId="0E342F1A">
+            <wp:extent cx="3010161" cy="743014"/>
+            <wp:effectExtent l="0" t="0" r="0" b="0"/>
+            <wp:docPr id="1544873120" name="תמונה 1"/>
+            <wp:cNvGraphicFramePr>
+              <a:graphicFrameLocks xmlns:a="http://schemas.openxmlformats.org/drawingml/2006/main" noChangeAspect="1"/>
+            </wp:cNvGraphicFramePr>
+            <a:graphic xmlns:a="http://schemas.openxmlformats.org/drawingml/2006/main">
+              <a:graphicData uri="http://schemas.openxmlformats.org/drawingml/2006/picture">
+                <pic:pic xmlns:pic="http://schemas.openxmlformats.org/drawingml/2006/picture">
+                  <pic:nvPicPr>
+                    <pic:cNvPr id="1544873120" name=""/>
+                    <pic:cNvPicPr/>
+                  </pic:nvPicPr>
+                  <pic:blipFill>
+                    <a:blip r:embed="rId12"/>
+                    <a:stretch>
+                      <a:fillRect/>
+                    </a:stretch>
+                  </pic:blipFill>
+                  <pic:spPr>
+                    <a:xfrm>
+                      <a:off x="0" y="0"/>
+                      <a:ext cx="3010161" cy="743014"/>
+                    </a:xfrm>
+                    <a:prstGeom prst="rect">
+                      <a:avLst/>
+                    </a:prstGeom>
+                  </pic:spPr>
+                </pic:pic>
+              </a:graphicData>
+            </a:graphic>
+          </wp:inline>
+        </w:drawing>
+      </w:r>
+    </w:p>
+    <w:p>
+      <w:r>
+        <w:t xml:space="preserve">After short </w:t>
+      </w:r>
+      <w:r>
+        <w:t xml:space="preserve">navigation in the files, I found the user think’s directory </w:t>
+      </w:r>
+      <w:r>
+        <w:t xml:space="preserve">in </w:t>
+      </w:r>
+      <w:r>
+        <w:t>the /home directory</w:t>
+      </w:r>
+      <w:r>
+        <w:t>, but unfortunately I couldn’t open it.</w:t>
+      </w:r>
+      <w:r>
+        <w:t xml:space="preserve"> </w:t>
+      </w:r>
+    </w:p>
+    <w:p>
+      <w:r>
+        <w:t xml:space="preserve">Thereafter, I found </w:t>
+      </w:r>
+      <w:r>
+        <w:t>a .git directory on /opt</w:t>
+      </w:r>
+      <w:r>
+        <w:t>/dev</w:t>
+      </w:r>
+      <w:r>
+        <w:t xml:space="preserve"> and this is its content</w:t>
+      </w:r>
+      <w:r>
+        <w:t>:</w:t>
+      </w:r>
+    </w:p>
+    <w:p>
+      <w:r>
+        <w:drawing>
+          <wp:inline distT="0" distB="0" distL="0" distR="0" wp14:anchorId="10DB0B0C" wp14:editId="3E438C2C">
+            <wp:extent cx="3170195" cy="1665114"/>
+            <wp:effectExtent l="0" t="0" r="0" b="0"/>
+            <wp:docPr id="1822135231" name="תמונה 1"/>
+            <wp:cNvGraphicFramePr>
+              <a:graphicFrameLocks xmlns:a="http://schemas.openxmlformats.org/drawingml/2006/main" noChangeAspect="1"/>
+            </wp:cNvGraphicFramePr>
+            <a:graphic xmlns:a="http://schemas.openxmlformats.org/drawingml/2006/main">
+              <a:graphicData uri="http://schemas.openxmlformats.org/drawingml/2006/picture">
+                <pic:pic xmlns:pic="http://schemas.openxmlformats.org/drawingml/2006/picture">
+                  <pic:nvPicPr>
+                    <pic:cNvPr id="1822135231" name=""/>
+                    <pic:cNvPicPr/>
+                  </pic:nvPicPr>
+                  <pic:blipFill>
+                    <a:blip r:embed="rId13"/>
+                    <a:stretch>
+                      <a:fillRect/>
+                    </a:stretch>
+                  </pic:blipFill>
+                  <pic:spPr>
+                    <a:xfrm>
+                      <a:off x="0" y="0"/>
+                      <a:ext cx="3170195" cy="1665114"/>
+                    </a:xfrm>
+                    <a:prstGeom prst="rect">
+                      <a:avLst/>
+                    </a:prstGeom>
+                  </pic:spPr>
+                </pic:pic>
+              </a:graphicData>
+            </a:graphic>
+          </wp:inline>
+        </w:drawing>
+      </w:r>
+    </w:p>
+    <w:p>
+      <w:r>
+        <w:t xml:space="preserve">Seems like think’s </w:t>
+      </w:r>
+      <w:r>
+        <w:t>git directory.</w:t>
+      </w:r>
+      <w:r>
+        <w:t xml:space="preserve"> </w:t>
+      </w:r>
+      <w:r>
+        <w:t>I opened the config file and found this:</w:t>
+      </w:r>
+    </w:p>
+    <w:p>
+      <w:r>
+        <w:drawing>
+          <wp:inline distT="0" distB="0" distL="0" distR="0" wp14:anchorId="2B7B5D49" wp14:editId="36B67B9B">
+            <wp:extent cx="2103302" cy="1809907"/>
+            <wp:effectExtent l="0" t="0" r="0" b="0"/>
+            <wp:docPr id="1019704098" name="תמונה 1"/>
+            <wp:cNvGraphicFramePr>
+              <a:graphicFrameLocks xmlns:a="http://schemas.openxmlformats.org/drawingml/2006/main" noChangeAspect="1"/>
+            </wp:cNvGraphicFramePr>
+            <a:graphic xmlns:a="http://schemas.openxmlformats.org/drawingml/2006/main">
+              <a:graphicData uri="http://schemas.openxmlformats.org/drawingml/2006/picture">
+                <pic:pic xmlns:pic="http://schemas.openxmlformats.org/drawingml/2006/picture">
+                  <pic:nvPicPr>
+                    <pic:cNvPr id="1019704098" name=""/>
+                    <pic:cNvPicPr/>
+                  </pic:nvPicPr>
+                  <pic:blipFill>
+                    <a:blip r:embed="rId14"/>
+                    <a:stretch>
+                      <a:fillRect/>
+                    </a:stretch>
+                  </pic:blipFill>
+                  <pic:spPr>
+                    <a:xfrm>
+                      <a:off x="0" y="0"/>
+                      <a:ext cx="2103302" cy="1809907"/>
+                    </a:xfrm>
+                    <a:prstGeom prst="rect">
+                      <a:avLst/>
+                    </a:prstGeom>
+                  </pic:spPr>
+                </pic:pic>
+              </a:graphicData>
+            </a:graphic>
+          </wp:inline>
+        </w:drawing>
+      </w:r>
+    </w:p>
+    <w:p>
+      <w:r>
+        <w:t xml:space="preserve">I actually got his </w:t>
+      </w:r>
+      <w:proofErr w:type="spellStart"/>
+      <w:r>
+        <w:t>github</w:t>
+      </w:r>
+      <w:proofErr w:type="spellEnd"/>
+      <w:r>
+        <w:t xml:space="preserve"> profile credentials.</w:t>
+      </w:r>
+    </w:p>
+    <w:p>
+      <w:r>
+        <w:t xml:space="preserve">So, of course I </w:t>
+      </w:r>
+      <w:r>
+        <w:t xml:space="preserve">tried to connect to his </w:t>
+      </w:r>
+      <w:r>
+        <w:t>profile,</w:t>
+      </w:r>
+      <w:r>
+        <w:t xml:space="preserve"> but this was a fake user.</w:t>
+      </w:r>
+      <w:r>
+        <w:t xml:space="preserve"> I thought a bit and realize that probably he uses this password also for this linux </w:t>
+      </w:r>
+      <w:r>
+        <w:t>machine,</w:t>
+      </w:r>
+      <w:r>
+        <w:t xml:space="preserve"> so I </w:t>
+      </w:r>
+      <w:r>
+        <w:t>tried to login as the user think and it worked!</w:t>
+      </w:r>
+    </w:p>
+    <w:p>
+      <w:r>
+        <w:drawing>
+          <wp:inline distT="0" distB="0" distL="0" distR="0" wp14:anchorId="27335065" wp14:editId="769FF59A">
+            <wp:extent cx="1703218" cy="628704"/>
+            <wp:effectExtent l="0" t="0" r="0" b="0"/>
+            <wp:docPr id="447939456" name="תמונה 1"/>
+            <wp:cNvGraphicFramePr>
+              <a:graphicFrameLocks xmlns:a="http://schemas.openxmlformats.org/drawingml/2006/main" noChangeAspect="1"/>
+            </wp:cNvGraphicFramePr>
+            <a:graphic xmlns:a="http://schemas.openxmlformats.org/drawingml/2006/main">
+              <a:graphicData uri="http://schemas.openxmlformats.org/drawingml/2006/picture">
+                <pic:pic xmlns:pic="http://schemas.openxmlformats.org/drawingml/2006/picture">
+                  <pic:nvPicPr>
+                    <pic:cNvPr id="447939456" name=""/>
+                    <pic:cNvPicPr/>
+                  </pic:nvPicPr>
+                  <pic:blipFill>
+                    <a:blip r:embed="rId15"/>
+                    <a:stretch>
+                      <a:fillRect/>
+                    </a:stretch>
+                  </pic:blipFill>
+                  <pic:spPr>
+                    <a:xfrm>
+                      <a:off x="0" y="0"/>
+                      <a:ext cx="1703218" cy="628704"/>
+                    </a:xfrm>
+                    <a:prstGeom prst="rect">
+                      <a:avLst/>
+                    </a:prstGeom>
+                  </pic:spPr>
+                </pic:pic>
+              </a:graphicData>
+            </a:graphic>
+          </wp:inline>
+        </w:drawing>
+      </w:r>
+    </w:p>
+    <w:p>
+      <w:r>
+        <w:lastRenderedPageBreak/>
+        <w:t xml:space="preserve">In think’s folder, I found the user </w:t>
+      </w:r>
+      <w:r>
+        <w:t>flag</w:t>
+      </w:r>
+      <w:r>
+        <w:t xml:space="preserve"> in the user.txt </w:t>
+      </w:r>
+      <w:r>
+        <w:t>file</w:t>
+      </w:r>
+      <w:r>
+        <w:t>:</w:t>
+      </w:r>
+    </w:p>
+    <w:p>
+      <w:r>
+        <w:drawing>
+          <wp:inline distT="0" distB="0" distL="0" distR="0" wp14:anchorId="01DDE851" wp14:editId="370FE6B6">
+            <wp:extent cx="2069009" cy="400085"/>
+            <wp:effectExtent l="0" t="0" r="7620" b="0"/>
+            <wp:docPr id="1730979559" name="תמונה 1" descr="תמונה שמכילה טקסט, גופן, צילום מסך&#10;&#10;תוכן בינה מלאכותית גנרטיבית עשוי להיות שגוי."/>
+            <wp:cNvGraphicFramePr>
+              <a:graphicFrameLocks xmlns:a="http://schemas.openxmlformats.org/drawingml/2006/main" noChangeAspect="1"/>
+            </wp:cNvGraphicFramePr>
+            <a:graphic xmlns:a="http://schemas.openxmlformats.org/drawingml/2006/main">
+              <a:graphicData uri="http://schemas.openxmlformats.org/drawingml/2006/picture">
+                <pic:pic xmlns:pic="http://schemas.openxmlformats.org/drawingml/2006/picture">
+                  <pic:nvPicPr>
+                    <pic:cNvPr id="1730979559" name="תמונה 1" descr="תמונה שמכילה טקסט, גופן, צילום מסך&#10;&#10;תוכן בינה מלאכותית גנרטיבית עשוי להיות שגוי."/>
+                    <pic:cNvPicPr/>
+                  </pic:nvPicPr>
+                  <pic:blipFill>
+                    <a:blip r:embed="rId16"/>
+                    <a:stretch>
+                      <a:fillRect/>
+                    </a:stretch>
+                  </pic:blipFill>
+                  <pic:spPr>
+                    <a:xfrm>
+                      <a:off x="0" y="0"/>
+                      <a:ext cx="2069009" cy="400085"/>
+                    </a:xfrm>
+                    <a:prstGeom prst="rect">
+                      <a:avLst/>
+                    </a:prstGeom>
+                  </pic:spPr>
+                </pic:pic>
+              </a:graphicData>
+            </a:graphic>
+          </wp:inline>
+        </w:drawing>
+      </w:r>
+    </w:p>
+    <w:p>
+      <w:r>
+        <w:t>Before I continued this ctf, I switched to ssh in order to upgrade the shell:</w:t>
+      </w:r>
+    </w:p>
+    <w:p>
+      <w:r>
+        <w:t>I entered this command “</w:t>
+      </w:r>
+      <w:r>
+        <w:t xml:space="preserve">ssh </w:t>
+      </w:r>
+      <w:proofErr w:type="spellStart"/>
+      <w:r>
+        <w:t>think@__target_IP</w:t>
+      </w:r>
+      <w:proofErr w:type="spellEnd"/>
+      <w:r>
+        <w:t>__</w:t>
+      </w:r>
+      <w:r>
+        <w:t>” and I entered think’s password that I found previously</w:t>
+      </w:r>
+      <w:r>
+        <w:t>.</w:t>
+      </w:r>
+    </w:p>
+    <w:p>
+      <w:r>
+        <w:t>Then, I came back to the git repository. There, I opened th</w:t>
+      </w:r>
+      <w:r>
+        <w:t xml:space="preserve">e </w:t>
+      </w:r>
+      <w:r>
+        <w:t>HEAD file:</w:t>
+      </w:r>
+    </w:p>
+    <w:p>
+      <w:r>
+        <w:drawing>
+          <wp:inline distT="0" distB="0" distL="0" distR="0" wp14:anchorId="76BFB7EE" wp14:editId="34000E70">
+            <wp:extent cx="2533870" cy="266723"/>
+            <wp:effectExtent l="0" t="0" r="0" b="0"/>
+            <wp:docPr id="1675205332" name="תמונה 1"/>
+            <wp:cNvGraphicFramePr>
+              <a:graphicFrameLocks xmlns:a="http://schemas.openxmlformats.org/drawingml/2006/main" noChangeAspect="1"/>
+            </wp:cNvGraphicFramePr>
+            <a:graphic xmlns:a="http://schemas.openxmlformats.org/drawingml/2006/main">
+              <a:graphicData uri="http://schemas.openxmlformats.org/drawingml/2006/picture">
+                <pic:pic xmlns:pic="http://schemas.openxmlformats.org/drawingml/2006/picture">
+                  <pic:nvPicPr>
+                    <pic:cNvPr id="1675205332" name=""/>
+                    <pic:cNvPicPr/>
+                  </pic:nvPicPr>
+                  <pic:blipFill>
+                    <a:blip r:embed="rId17"/>
+                    <a:stretch>
+                      <a:fillRect/>
+                    </a:stretch>
+                  </pic:blipFill>
+                  <pic:spPr>
+                    <a:xfrm>
+                      <a:off x="0" y="0"/>
+                      <a:ext cx="2533870" cy="266723"/>
+                    </a:xfrm>
+                    <a:prstGeom prst="rect">
+                      <a:avLst/>
+                    </a:prstGeom>
+                  </pic:spPr>
+                </pic:pic>
+              </a:graphicData>
+            </a:graphic>
+          </wp:inline>
+        </w:drawing>
+      </w:r>
+    </w:p>
+    <w:p>
+      <w:r>
+        <w:t xml:space="preserve">Thereafter, I </w:t>
+      </w:r>
+      <w:r>
+        <w:t>navigated to th</w:t>
+      </w:r>
+      <w:r>
+        <w:t>is path:</w:t>
+      </w:r>
     </w:p>
     <w:p/>
     <w:sectPr>
@@ -1290,6 +1893,18 @@
       <w:shd w:val="clear" w:color="auto" w:fill="E1DFDD"/>
     </w:rPr>
   </w:style>
+  <w:style w:type="character" w:styleId="FollowedHyperlink">
+    <w:name w:val="FollowedHyperlink"/>
+    <w:basedOn w:val="a0"/>
+    <w:uiPriority w:val="99"/>
+    <w:semiHidden/>
+    <w:unhideWhenUsed/>
+    <w:rsid w:val="00136A38"/>
+    <w:rPr>
+      <w:color w:val="96607D" w:themeColor="followedHyperlink"/>
+      <w:u w:val="single"/>
+    </w:rPr>
+  </w:style>
 </w:styles>
 </file>
 

</xml_diff>

<commit_message>
Continue the pyrat thm ctf later
</commit_message>
<xml_diff>
--- a/THM_challenges/Easy/Pyrat/Pyrat_Solution_Documentation.docx
+++ b/THM_challenges/Easy/Pyrat/Pyrat_Solution_Documentation.docx
@@ -267,6 +267,9 @@
     </w:p>
     <w:p>
       <w:r>
+        <w:rPr>
+          <w:noProof/>
+        </w:rPr>
         <w:drawing>
           <wp:inline distT="0" distB="0" distL="0" distR="0" wp14:anchorId="39495C0A" wp14:editId="5544C4D4">
             <wp:extent cx="1409822" cy="502964"/>
@@ -314,13 +317,8 @@
       <w:r>
         <w:t xml:space="preserve">so it probably </w:t>
       </w:r>
-      <w:proofErr w:type="gramStart"/>
-      <w:r>
-        <w:t>try</w:t>
-      </w:r>
-      <w:proofErr w:type="gramEnd"/>
-      <w:r>
-        <w:t xml:space="preserve"> to </w:t>
+      <w:r>
+        <w:t xml:space="preserve">try to </w:t>
       </w:r>
       <w:r>
         <w:t xml:space="preserve">execute </w:t>
@@ -337,6 +335,9 @@
     </w:p>
     <w:p>
       <w:r>
+        <w:rPr>
+          <w:noProof/>
+        </w:rPr>
         <w:drawing>
           <wp:inline distT="0" distB="0" distL="0" distR="0" wp14:anchorId="66CB29FB" wp14:editId="1B16707B">
             <wp:extent cx="1169771" cy="266723"/>
@@ -404,6 +405,9 @@
     </w:p>
     <w:p>
       <w:r>
+        <w:rPr>
+          <w:noProof/>
+        </w:rPr>
         <w:lastRenderedPageBreak/>
         <w:drawing>
           <wp:inline distT="0" distB="0" distL="0" distR="0" wp14:anchorId="563E505D" wp14:editId="2F9DD9DA">
@@ -455,6 +459,9 @@
     </w:p>
     <w:p>
       <w:r>
+        <w:rPr>
+          <w:noProof/>
+        </w:rPr>
         <w:drawing>
           <wp:inline distT="0" distB="0" distL="0" distR="0" wp14:anchorId="7CEAADAD" wp14:editId="5215AF92">
             <wp:extent cx="1531753" cy="400085"/>
@@ -499,6 +506,9 @@
     </w:p>
     <w:p>
       <w:r>
+        <w:rPr>
+          <w:noProof/>
+        </w:rPr>
         <w:drawing>
           <wp:inline distT="0" distB="0" distL="0" distR="0" wp14:anchorId="5CAD0723" wp14:editId="74F7A3DA">
             <wp:extent cx="3600762" cy="331499"/>
@@ -552,6 +562,9 @@
     </w:p>
     <w:p>
       <w:r>
+        <w:rPr>
+          <w:noProof/>
+        </w:rPr>
         <w:drawing>
           <wp:inline distT="0" distB="0" distL="0" distR="0" wp14:anchorId="7C9F8166" wp14:editId="0E342F1A">
             <wp:extent cx="3010161" cy="743014"/>
@@ -628,6 +641,9 @@
     </w:p>
     <w:p>
       <w:r>
+        <w:rPr>
+          <w:noProof/>
+        </w:rPr>
         <w:drawing>
           <wp:inline distT="0" distB="0" distL="0" distR="0" wp14:anchorId="10DB0B0C" wp14:editId="3E438C2C">
             <wp:extent cx="3170195" cy="1665114"/>
@@ -681,6 +697,9 @@
     </w:p>
     <w:p>
       <w:r>
+        <w:rPr>
+          <w:noProof/>
+        </w:rPr>
         <w:drawing>
           <wp:inline distT="0" distB="0" distL="0" distR="0" wp14:anchorId="2B7B5D49" wp14:editId="36B67B9B">
             <wp:extent cx="2103302" cy="1809907"/>
@@ -759,6 +778,9 @@
     </w:p>
     <w:p>
       <w:r>
+        <w:rPr>
+          <w:noProof/>
+        </w:rPr>
         <w:drawing>
           <wp:inline distT="0" distB="0" distL="0" distR="0" wp14:anchorId="27335065" wp14:editId="769FF59A">
             <wp:extent cx="1703218" cy="628704"/>
@@ -816,6 +838,9 @@
     </w:p>
     <w:p>
       <w:r>
+        <w:rPr>
+          <w:noProof/>
+        </w:rPr>
         <w:drawing>
           <wp:inline distT="0" distB="0" distL="0" distR="0" wp14:anchorId="01DDE851" wp14:editId="370FE6B6">
             <wp:extent cx="2069009" cy="400085"/>
@@ -888,16 +913,16 @@
         <w:t xml:space="preserve">e </w:t>
       </w:r>
       <w:r>
-        <w:t>HEAD file:</w:t>
+        <w:t>COMMIT_EDITMSG file:</w:t>
       </w:r>
     </w:p>
     <w:p>
       <w:r>
         <w:drawing>
-          <wp:inline distT="0" distB="0" distL="0" distR="0" wp14:anchorId="76BFB7EE" wp14:editId="34000E70">
-            <wp:extent cx="2533870" cy="266723"/>
+          <wp:inline distT="0" distB="0" distL="0" distR="0" wp14:anchorId="4685F9D4" wp14:editId="1CCE0938">
+            <wp:extent cx="3105419" cy="236240"/>
             <wp:effectExtent l="0" t="0" r="0" b="0"/>
-            <wp:docPr id="1675205332" name="תמונה 1"/>
+            <wp:docPr id="386096449" name="תמונה 1"/>
             <wp:cNvGraphicFramePr>
               <a:graphicFrameLocks xmlns:a="http://schemas.openxmlformats.org/drawingml/2006/main" noChangeAspect="1"/>
             </wp:cNvGraphicFramePr>
@@ -905,7 +930,7 @@
               <a:graphicData uri="http://schemas.openxmlformats.org/drawingml/2006/picture">
                 <pic:pic xmlns:pic="http://schemas.openxmlformats.org/drawingml/2006/picture">
                   <pic:nvPicPr>
-                    <pic:cNvPr id="1675205332" name=""/>
+                    <pic:cNvPr id="386096449" name=""/>
                     <pic:cNvPicPr/>
                   </pic:nvPicPr>
                   <pic:blipFill>
@@ -917,7 +942,7 @@
                   <pic:spPr>
                     <a:xfrm>
                       <a:off x="0" y="0"/>
-                      <a:ext cx="2533870" cy="266723"/>
+                      <a:ext cx="3105419" cy="236240"/>
                     </a:xfrm>
                     <a:prstGeom prst="rect">
                       <a:avLst/>
@@ -932,16 +957,394 @@
     </w:p>
     <w:p>
       <w:r>
-        <w:t xml:space="preserve">Thereafter, I </w:t>
-      </w:r>
-      <w:r>
-        <w:t>navigated to th</w:t>
-      </w:r>
-      <w:r>
-        <w:t>is path:</w:t>
-      </w:r>
-    </w:p>
-    <w:p/>
+        <w:t xml:space="preserve">From here, I thought </w:t>
+      </w:r>
+      <w:r>
+        <w:t>about finding</w:t>
+      </w:r>
+      <w:r>
+        <w:t xml:space="preserve"> the added shell endpoint. </w:t>
+      </w:r>
+      <w:r>
+        <w:t>I started by opening the HEAD file of the /logs directory:</w:t>
+      </w:r>
+    </w:p>
+    <w:p>
+      <w:r>
+        <w:drawing>
+          <wp:inline distT="0" distB="0" distL="0" distR="0" wp14:anchorId="35ABA4C3" wp14:editId="3242EAE4">
+            <wp:extent cx="7556500" cy="185420"/>
+            <wp:effectExtent l="0" t="0" r="6350" b="5080"/>
+            <wp:docPr id="166569661" name="תמונה 1"/>
+            <wp:cNvGraphicFramePr>
+              <a:graphicFrameLocks xmlns:a="http://schemas.openxmlformats.org/drawingml/2006/main" noChangeAspect="1"/>
+            </wp:cNvGraphicFramePr>
+            <a:graphic xmlns:a="http://schemas.openxmlformats.org/drawingml/2006/main">
+              <a:graphicData uri="http://schemas.openxmlformats.org/drawingml/2006/picture">
+                <pic:pic xmlns:pic="http://schemas.openxmlformats.org/drawingml/2006/picture">
+                  <pic:nvPicPr>
+                    <pic:cNvPr id="166569661" name=""/>
+                    <pic:cNvPicPr/>
+                  </pic:nvPicPr>
+                  <pic:blipFill>
+                    <a:blip r:embed="rId18"/>
+                    <a:stretch>
+                      <a:fillRect/>
+                    </a:stretch>
+                  </pic:blipFill>
+                  <pic:spPr>
+                    <a:xfrm>
+                      <a:off x="0" y="0"/>
+                      <a:ext cx="7556500" cy="185420"/>
+                    </a:xfrm>
+                    <a:prstGeom prst="rect">
+                      <a:avLst/>
+                    </a:prstGeom>
+                  </pic:spPr>
+                </pic:pic>
+              </a:graphicData>
+            </a:graphic>
+          </wp:inline>
+        </w:drawing>
+      </w:r>
+    </w:p>
+    <w:p>
+      <w:r>
+        <w:t xml:space="preserve">Here I </w:t>
+      </w:r>
+      <w:r>
+        <w:t>saw that that last commit (which is also the first and the only commits that has been committed in this repository)</w:t>
+      </w:r>
+      <w:r>
+        <w:t xml:space="preserve"> has been committed by “Jose Mario” </w:t>
+      </w:r>
+      <w:r>
+        <w:t>and there he added the shell endpoint.</w:t>
+      </w:r>
+      <w:r>
+        <w:t xml:space="preserve"> I explored more about this commit:</w:t>
+      </w:r>
+    </w:p>
+    <w:p>
+      <w:r>
+        <w:drawing>
+          <wp:inline distT="0" distB="0" distL="0" distR="0" wp14:anchorId="7530C1AD" wp14:editId="6A83009B">
+            <wp:extent cx="5505927" cy="998307"/>
+            <wp:effectExtent l="0" t="0" r="0" b="0"/>
+            <wp:docPr id="1953071759" name="תמונה 1"/>
+            <wp:cNvGraphicFramePr>
+              <a:graphicFrameLocks xmlns:a="http://schemas.openxmlformats.org/drawingml/2006/main" noChangeAspect="1"/>
+            </wp:cNvGraphicFramePr>
+            <a:graphic xmlns:a="http://schemas.openxmlformats.org/drawingml/2006/main">
+              <a:graphicData uri="http://schemas.openxmlformats.org/drawingml/2006/picture">
+                <pic:pic xmlns:pic="http://schemas.openxmlformats.org/drawingml/2006/picture">
+                  <pic:nvPicPr>
+                    <pic:cNvPr id="1953071759" name=""/>
+                    <pic:cNvPicPr/>
+                  </pic:nvPicPr>
+                  <pic:blipFill>
+                    <a:blip r:embed="rId19"/>
+                    <a:stretch>
+                      <a:fillRect/>
+                    </a:stretch>
+                  </pic:blipFill>
+                  <pic:spPr>
+                    <a:xfrm>
+                      <a:off x="0" y="0"/>
+                      <a:ext cx="5505927" cy="998307"/>
+                    </a:xfrm>
+                    <a:prstGeom prst="rect">
+                      <a:avLst/>
+                    </a:prstGeom>
+                  </pic:spPr>
+                </pic:pic>
+              </a:graphicData>
+            </a:graphic>
+          </wp:inline>
+        </w:drawing>
+      </w:r>
+    </w:p>
+    <w:p>
+      <w:r>
+        <w:t xml:space="preserve">I saw here that a python file </w:t>
+      </w:r>
+      <w:r>
+        <w:t xml:space="preserve">named “pyrat.py” </w:t>
+      </w:r>
+      <w:r>
+        <w:t>(with “.old” extension</w:t>
+      </w:r>
+      <w:r>
+        <w:t xml:space="preserve"> which</w:t>
+      </w:r>
+      <w:r>
+        <w:t xml:space="preserve"> </w:t>
+      </w:r>
+      <w:r>
+        <w:t>used to indicate a backup or previous version of a file</w:t>
+      </w:r>
+      <w:r>
+        <w:t>)</w:t>
+      </w:r>
+      <w:r>
+        <w:t xml:space="preserve">. </w:t>
+      </w:r>
+    </w:p>
+    <w:p>
+      <w:r>
+        <w:t xml:space="preserve">Then, I </w:t>
+      </w:r>
+      <w:r>
+        <w:t xml:space="preserve">tried to </w:t>
+      </w:r>
+      <w:r>
+        <w:t xml:space="preserve">get the pyrat file by checking out the </w:t>
+      </w:r>
+      <w:r>
+        <w:t xml:space="preserve">last commit, but unfortunately, </w:t>
+      </w:r>
+      <w:r>
+        <w:t>it wasn’t so easy because there was a problem with the repository tree.</w:t>
+      </w:r>
+      <w:r>
+        <w:t xml:space="preserve"> Therefore, I </w:t>
+      </w:r>
+      <w:r>
+        <w:t xml:space="preserve">decided to </w:t>
+      </w:r>
+      <w:r>
+        <w:t>forcefully</w:t>
+      </w:r>
+      <w:r>
+        <w:rPr>
+          <w:rFonts w:hint="cs"/>
+          <w:rtl/>
+        </w:rPr>
+        <w:t xml:space="preserve"> </w:t>
+      </w:r>
+      <w:r>
+        <w:t xml:space="preserve">to download this file by </w:t>
+      </w:r>
+      <w:r>
+        <w:t xml:space="preserve">ignoring the </w:t>
+      </w:r>
+      <w:r>
+        <w:t>tree:</w:t>
+      </w:r>
+    </w:p>
+    <w:p>
+      <w:r>
+        <w:drawing>
+          <wp:inline distT="0" distB="0" distL="0" distR="0" wp14:anchorId="46861444" wp14:editId="20C44CBF">
+            <wp:extent cx="4267570" cy="209568"/>
+            <wp:effectExtent l="0" t="0" r="0" b="0"/>
+            <wp:docPr id="315191422" name="תמונה 1"/>
+            <wp:cNvGraphicFramePr>
+              <a:graphicFrameLocks xmlns:a="http://schemas.openxmlformats.org/drawingml/2006/main" noChangeAspect="1"/>
+            </wp:cNvGraphicFramePr>
+            <a:graphic xmlns:a="http://schemas.openxmlformats.org/drawingml/2006/main">
+              <a:graphicData uri="http://schemas.openxmlformats.org/drawingml/2006/picture">
+                <pic:pic xmlns:pic="http://schemas.openxmlformats.org/drawingml/2006/picture">
+                  <pic:nvPicPr>
+                    <pic:cNvPr id="315191422" name=""/>
+                    <pic:cNvPicPr/>
+                  </pic:nvPicPr>
+                  <pic:blipFill>
+                    <a:blip r:embed="rId20"/>
+                    <a:stretch>
+                      <a:fillRect/>
+                    </a:stretch>
+                  </pic:blipFill>
+                  <pic:spPr>
+                    <a:xfrm>
+                      <a:off x="0" y="0"/>
+                      <a:ext cx="4267570" cy="209568"/>
+                    </a:xfrm>
+                    <a:prstGeom prst="rect">
+                      <a:avLst/>
+                    </a:prstGeom>
+                  </pic:spPr>
+                </pic:pic>
+              </a:graphicData>
+            </a:graphic>
+          </wp:inline>
+        </w:drawing>
+      </w:r>
+    </w:p>
+    <w:p>
+      <w:r>
+        <w:t>And this is the file content:</w:t>
+      </w:r>
+    </w:p>
+    <w:p>
+      <w:pPr>
+        <w:rPr>
+          <w:rtl/>
+        </w:rPr>
+      </w:pPr>
+      <w:r>
+        <w:drawing>
+          <wp:inline distT="0" distB="0" distL="0" distR="0" wp14:anchorId="1386C5ED" wp14:editId="016A9A47">
+            <wp:extent cx="3772227" cy="3105419"/>
+            <wp:effectExtent l="0" t="0" r="0" b="0"/>
+            <wp:docPr id="967929222" name="תמונה 1" descr="תמונה שמכילה טקסט, צילום מסך, גופן&#10;&#10;תוכן בינה מלאכותית גנרטיבית עשוי להיות שגוי."/>
+            <wp:cNvGraphicFramePr>
+              <a:graphicFrameLocks xmlns:a="http://schemas.openxmlformats.org/drawingml/2006/main" noChangeAspect="1"/>
+            </wp:cNvGraphicFramePr>
+            <a:graphic xmlns:a="http://schemas.openxmlformats.org/drawingml/2006/main">
+              <a:graphicData uri="http://schemas.openxmlformats.org/drawingml/2006/picture">
+                <pic:pic xmlns:pic="http://schemas.openxmlformats.org/drawingml/2006/picture">
+                  <pic:nvPicPr>
+                    <pic:cNvPr id="967929222" name="תמונה 1" descr="תמונה שמכילה טקסט, צילום מסך, גופן&#10;&#10;תוכן בינה מלאכותית גנרטיבית עשוי להיות שגוי."/>
+                    <pic:cNvPicPr/>
+                  </pic:nvPicPr>
+                  <pic:blipFill>
+                    <a:blip r:embed="rId21"/>
+                    <a:stretch>
+                      <a:fillRect/>
+                    </a:stretch>
+                  </pic:blipFill>
+                  <pic:spPr>
+                    <a:xfrm>
+                      <a:off x="0" y="0"/>
+                      <a:ext cx="3772227" cy="3105419"/>
+                    </a:xfrm>
+                    <a:prstGeom prst="rect">
+                      <a:avLst/>
+                    </a:prstGeom>
+                  </pic:spPr>
+                </pic:pic>
+              </a:graphicData>
+            </a:graphic>
+          </wp:inline>
+        </w:drawing>
+      </w:r>
+    </w:p>
+    <w:p>
+      <w:r>
+        <w:t xml:space="preserve">I </w:t>
+      </w:r>
+      <w:r>
+        <w:t>analyzed</w:t>
+      </w:r>
+      <w:r>
+        <w:t xml:space="preserve"> </w:t>
+      </w:r>
+      <w:r>
+        <w:t>the script a bit and understood what the 2 functions do:</w:t>
+      </w:r>
+    </w:p>
+    <w:p>
+      <w:r>
+        <w:rPr>
+          <w:b/>
+          <w:bCs/>
+          <w:u w:val="single"/>
+        </w:rPr>
+        <w:lastRenderedPageBreak/>
+        <w:t>“</w:t>
+      </w:r>
+      <w:proofErr w:type="spellStart"/>
+      <w:r>
+        <w:rPr>
+          <w:b/>
+          <w:bCs/>
+          <w:u w:val="single"/>
+        </w:rPr>
+        <w:t>switch_case</w:t>
+      </w:r>
+      <w:proofErr w:type="spellEnd"/>
+      <w:r>
+        <w:rPr>
+          <w:b/>
+          <w:bCs/>
+          <w:u w:val="single"/>
+        </w:rPr>
+        <w:t>”</w:t>
+      </w:r>
+      <w:r>
+        <w:t xml:space="preserve"> – A function that get the client socket and data and </w:t>
+      </w:r>
+      <w:r>
+        <w:t xml:space="preserve">choose if to give the client a bash shell access or probably a python </w:t>
+      </w:r>
+      <w:r>
+        <w:t>interactive shell.</w:t>
+      </w:r>
+    </w:p>
+    <w:p>
+      <w:pPr>
+        <w:tabs>
+          <w:tab w:val="left" w:pos="3562"/>
+        </w:tabs>
+      </w:pPr>
+      <w:r>
+        <w:rPr>
+          <w:b/>
+          <w:bCs/>
+          <w:u w:val="single"/>
+        </w:rPr>
+        <w:t>“shell”</w:t>
+      </w:r>
+      <w:r>
+        <w:t xml:space="preserve"> </w:t>
+      </w:r>
+      <w:r>
+        <w:t>–</w:t>
+      </w:r>
+      <w:r>
+        <w:t xml:space="preserve"> </w:t>
+      </w:r>
+      <w:r>
+        <w:t>A function that</w:t>
+      </w:r>
+      <w:r>
+        <w:t xml:space="preserve"> </w:t>
+      </w:r>
+      <w:r>
+        <w:t>creates a</w:t>
+      </w:r>
+      <w:r>
+        <w:t xml:space="preserve"> remote shell</w:t>
+      </w:r>
+      <w:r>
+        <w:t xml:space="preserve"> </w:t>
+      </w:r>
+      <w:r>
+        <w:t>over the client socker</w:t>
+      </w:r>
+      <w:r>
+        <w:t xml:space="preserve"> </w:t>
+      </w:r>
+      <w:r>
+        <w:t>.</w:t>
+      </w:r>
+    </w:p>
+    <w:p>
+      <w:r>
+        <w:t xml:space="preserve">Now, I wanted </w:t>
+      </w:r>
+      <w:r>
+        <w:t xml:space="preserve">fulfill </w:t>
+      </w:r>
+      <w:r>
+        <w:t xml:space="preserve">the requirements to get a shell </w:t>
+      </w:r>
+      <w:r>
+        <w:t xml:space="preserve">by changing manually </w:t>
+      </w:r>
+      <w:r>
+        <w:t xml:space="preserve">the data to be equal to “shell” by </w:t>
+      </w:r>
+    </w:p>
+    <w:p>
+      <w:pPr>
+        <w:rPr>
+          <w:rFonts w:hint="cs"/>
+          <w:rtl/>
+        </w:rPr>
+      </w:pPr>
+    </w:p>
     <w:sectPr>
       <w:pgSz w:w="12240" w:h="15840"/>
       <w:pgMar w:top="170" w:right="170" w:bottom="170" w:left="170" w:header="720" w:footer="720" w:gutter="0"/>

</xml_diff>

<commit_message>
The Pyrat THM CTF was finished!
</commit_message>
<xml_diff>
--- a/THM_challenges/Easy/Pyrat/Pyrat_Solution_Documentation.docx
+++ b/THM_challenges/Easy/Pyrat/Pyrat_Solution_Documentation.docx
@@ -184,6 +184,7 @@
       <w:r>
         <w:t xml:space="preserve">and I </w:t>
       </w:r>
+      <w:proofErr w:type="gramStart"/>
       <w:r>
         <w:t>faced</w:t>
       </w:r>
@@ -191,7 +192,11 @@
         <w:t xml:space="preserve"> </w:t>
       </w:r>
       <w:r>
-        <w:t xml:space="preserve">with </w:t>
+        <w:t>with</w:t>
+      </w:r>
+      <w:proofErr w:type="gramEnd"/>
+      <w:r>
+        <w:t xml:space="preserve"> </w:t>
       </w:r>
       <w:r>
         <w:t>this message:</w:t>
@@ -317,8 +322,13 @@
       <w:r>
         <w:t xml:space="preserve">so it probably </w:t>
       </w:r>
-      <w:r>
-        <w:t xml:space="preserve">try to </w:t>
+      <w:proofErr w:type="gramStart"/>
+      <w:r>
+        <w:t>try</w:t>
+      </w:r>
+      <w:proofErr w:type="gramEnd"/>
+      <w:r>
+        <w:t xml:space="preserve"> to </w:t>
       </w:r>
       <w:r>
         <w:t xml:space="preserve">execute </w:t>
@@ -918,6 +928,9 @@
     </w:p>
     <w:p>
       <w:r>
+        <w:rPr>
+          <w:noProof/>
+        </w:rPr>
         <w:drawing>
           <wp:inline distT="0" distB="0" distL="0" distR="0" wp14:anchorId="4685F9D4" wp14:editId="1CCE0938">
             <wp:extent cx="3105419" cy="236240"/>
@@ -971,6 +984,9 @@
     </w:p>
     <w:p>
       <w:r>
+        <w:rPr>
+          <w:noProof/>
+        </w:rPr>
         <w:drawing>
           <wp:inline distT="0" distB="0" distL="0" distR="0" wp14:anchorId="35ABA4C3" wp14:editId="3242EAE4">
             <wp:extent cx="7556500" cy="185420"/>
@@ -1027,6 +1043,9 @@
     </w:p>
     <w:p>
       <w:r>
+        <w:rPr>
+          <w:noProof/>
+        </w:rPr>
         <w:drawing>
           <wp:inline distT="0" distB="0" distL="0" distR="0" wp14:anchorId="7530C1AD" wp14:editId="6A83009B">
             <wp:extent cx="5505927" cy="998307"/>
@@ -1122,8 +1141,13 @@
         </w:rPr>
         <w:t xml:space="preserve"> </w:t>
       </w:r>
-      <w:r>
-        <w:t xml:space="preserve">to download this file by </w:t>
+      <w:proofErr w:type="gramStart"/>
+      <w:r>
+        <w:t>to download</w:t>
+      </w:r>
+      <w:proofErr w:type="gramEnd"/>
+      <w:r>
+        <w:t xml:space="preserve"> this file by </w:t>
       </w:r>
       <w:r>
         <w:t xml:space="preserve">ignoring the </w:t>
@@ -1134,6 +1158,9 @@
     </w:p>
     <w:p>
       <w:r>
+        <w:rPr>
+          <w:noProof/>
+        </w:rPr>
         <w:drawing>
           <wp:inline distT="0" distB="0" distL="0" distR="0" wp14:anchorId="46861444" wp14:editId="20C44CBF">
             <wp:extent cx="4267570" cy="209568"/>
@@ -1183,6 +1210,9 @@
         </w:rPr>
       </w:pPr>
       <w:r>
+        <w:rPr>
+          <w:noProof/>
+        </w:rPr>
         <w:drawing>
           <wp:inline distT="0" distB="0" distL="0" distR="0" wp14:anchorId="1386C5ED" wp14:editId="016A9A47">
             <wp:extent cx="3772227" cy="3105419"/>
@@ -1322,29 +1352,574 @@
     </w:p>
     <w:p>
       <w:r>
-        <w:t xml:space="preserve">Now, I wanted </w:t>
-      </w:r>
-      <w:r>
-        <w:t xml:space="preserve">fulfill </w:t>
-      </w:r>
-      <w:r>
-        <w:t xml:space="preserve">the requirements to get a shell </w:t>
-      </w:r>
-      <w:r>
-        <w:t xml:space="preserve">by changing manually </w:t>
-      </w:r>
-      <w:r>
-        <w:t xml:space="preserve">the data to be equal to “shell” by </w:t>
-      </w:r>
-    </w:p>
-    <w:p>
-      <w:pPr>
-        <w:rPr>
-          <w:rFonts w:hint="cs"/>
-          <w:rtl/>
-        </w:rPr>
-      </w:pPr>
-    </w:p>
+        <w:t xml:space="preserve">Now, I </w:t>
+      </w:r>
+      <w:r>
+        <w:t>have returned</w:t>
+      </w:r>
+      <w:r>
+        <w:t xml:space="preserve"> back to the </w:t>
+      </w:r>
+      <w:r>
+        <w:t>python interactive shell</w:t>
+      </w:r>
+      <w:r>
+        <w:t xml:space="preserve"> and entered</w:t>
+      </w:r>
+      <w:r>
+        <w:t xml:space="preserve"> </w:t>
+      </w:r>
+      <w:r>
+        <w:t xml:space="preserve">the </w:t>
+      </w:r>
+      <w:r>
+        <w:t>“shell”</w:t>
+      </w:r>
+      <w:r>
+        <w:t xml:space="preserve"> command</w:t>
+      </w:r>
+      <w:r>
+        <w:t xml:space="preserve"> and, as expected, a shell was created</w:t>
+      </w:r>
+      <w:r>
+        <w:t>:</w:t>
+      </w:r>
+    </w:p>
+    <w:p>
+      <w:r>
+        <w:drawing>
+          <wp:inline distT="0" distB="0" distL="0" distR="0" wp14:anchorId="0147250C" wp14:editId="2164F27C">
+            <wp:extent cx="1474598" cy="838273"/>
+            <wp:effectExtent l="0" t="0" r="0" b="0"/>
+            <wp:docPr id="1814108445" name="תמונה 1"/>
+            <wp:cNvGraphicFramePr>
+              <a:graphicFrameLocks xmlns:a="http://schemas.openxmlformats.org/drawingml/2006/main" noChangeAspect="1"/>
+            </wp:cNvGraphicFramePr>
+            <a:graphic xmlns:a="http://schemas.openxmlformats.org/drawingml/2006/main">
+              <a:graphicData uri="http://schemas.openxmlformats.org/drawingml/2006/picture">
+                <pic:pic xmlns:pic="http://schemas.openxmlformats.org/drawingml/2006/picture">
+                  <pic:nvPicPr>
+                    <pic:cNvPr id="1814108445" name=""/>
+                    <pic:cNvPicPr/>
+                  </pic:nvPicPr>
+                  <pic:blipFill>
+                    <a:blip r:embed="rId22"/>
+                    <a:stretch>
+                      <a:fillRect/>
+                    </a:stretch>
+                  </pic:blipFill>
+                  <pic:spPr>
+                    <a:xfrm>
+                      <a:off x="0" y="0"/>
+                      <a:ext cx="1474598" cy="838273"/>
+                    </a:xfrm>
+                    <a:prstGeom prst="rect">
+                      <a:avLst/>
+                    </a:prstGeom>
+                  </pic:spPr>
+                </pic:pic>
+              </a:graphicData>
+            </a:graphic>
+          </wp:inline>
+        </w:drawing>
+      </w:r>
+    </w:p>
+    <w:p>
+      <w:r>
+        <w:t xml:space="preserve">The next step </w:t>
+      </w:r>
+      <w:r>
+        <w:t>was</w:t>
+      </w:r>
+      <w:r>
+        <w:t xml:space="preserve"> to find a way to escalate my </w:t>
+      </w:r>
+      <w:r>
+        <w:t>privileges</w:t>
+      </w:r>
+      <w:r>
+        <w:t>.</w:t>
+      </w:r>
+      <w:r>
+        <w:t xml:space="preserve"> I tried to fuzz some </w:t>
+      </w:r>
+      <w:r>
+        <w:t>endpoints using a custom script that I wrote in python:</w:t>
+      </w:r>
+    </w:p>
+    <w:p>
+      <w:r>
+        <w:drawing>
+          <wp:inline distT="0" distB="0" distL="0" distR="0" wp14:anchorId="0BE94157" wp14:editId="0A2785B1">
+            <wp:extent cx="7556500" cy="3183890"/>
+            <wp:effectExtent l="0" t="0" r="6350" b="0"/>
+            <wp:docPr id="1101762807" name="תמונה 1" descr="תמונה שמכילה טקסט, צילום מסך, גופן&#10;&#10;תוכן בינה מלאכותית גנרטיבית עשוי להיות שגוי."/>
+            <wp:cNvGraphicFramePr>
+              <a:graphicFrameLocks xmlns:a="http://schemas.openxmlformats.org/drawingml/2006/main" noChangeAspect="1"/>
+            </wp:cNvGraphicFramePr>
+            <a:graphic xmlns:a="http://schemas.openxmlformats.org/drawingml/2006/main">
+              <a:graphicData uri="http://schemas.openxmlformats.org/drawingml/2006/picture">
+                <pic:pic xmlns:pic="http://schemas.openxmlformats.org/drawingml/2006/picture">
+                  <pic:nvPicPr>
+                    <pic:cNvPr id="1101762807" name="תמונה 1" descr="תמונה שמכילה טקסט, צילום מסך, גופן&#10;&#10;תוכן בינה מלאכותית גנרטיבית עשוי להיות שגוי."/>
+                    <pic:cNvPicPr/>
+                  </pic:nvPicPr>
+                  <pic:blipFill>
+                    <a:blip r:embed="rId23"/>
+                    <a:stretch>
+                      <a:fillRect/>
+                    </a:stretch>
+                  </pic:blipFill>
+                  <pic:spPr>
+                    <a:xfrm>
+                      <a:off x="0" y="0"/>
+                      <a:ext cx="7556500" cy="3183890"/>
+                    </a:xfrm>
+                    <a:prstGeom prst="rect">
+                      <a:avLst/>
+                    </a:prstGeom>
+                  </pic:spPr>
+                </pic:pic>
+              </a:graphicData>
+            </a:graphic>
+          </wp:inline>
+        </w:drawing>
+      </w:r>
+    </w:p>
+    <w:p>
+      <w:r>
+        <w:t>The output:</w:t>
+      </w:r>
+    </w:p>
+    <w:p>
+      <w:r>
+        <w:drawing>
+          <wp:inline distT="0" distB="0" distL="0" distR="0" wp14:anchorId="6708CF1B" wp14:editId="57FE27C8">
+            <wp:extent cx="4103726" cy="1703218"/>
+            <wp:effectExtent l="0" t="0" r="0" b="0"/>
+            <wp:docPr id="108871727" name="תמונה 1"/>
+            <wp:cNvGraphicFramePr>
+              <a:graphicFrameLocks xmlns:a="http://schemas.openxmlformats.org/drawingml/2006/main" noChangeAspect="1"/>
+            </wp:cNvGraphicFramePr>
+            <a:graphic xmlns:a="http://schemas.openxmlformats.org/drawingml/2006/main">
+              <a:graphicData uri="http://schemas.openxmlformats.org/drawingml/2006/picture">
+                <pic:pic xmlns:pic="http://schemas.openxmlformats.org/drawingml/2006/picture">
+                  <pic:nvPicPr>
+                    <pic:cNvPr id="108871727" name=""/>
+                    <pic:cNvPicPr/>
+                  </pic:nvPicPr>
+                  <pic:blipFill>
+                    <a:blip r:embed="rId24"/>
+                    <a:stretch>
+                      <a:fillRect/>
+                    </a:stretch>
+                  </pic:blipFill>
+                  <pic:spPr>
+                    <a:xfrm>
+                      <a:off x="0" y="0"/>
+                      <a:ext cx="4103726" cy="1703218"/>
+                    </a:xfrm>
+                    <a:prstGeom prst="rect">
+                      <a:avLst/>
+                    </a:prstGeom>
+                  </pic:spPr>
+                </pic:pic>
+              </a:graphicData>
+            </a:graphic>
+          </wp:inline>
+        </w:drawing>
+      </w:r>
+    </w:p>
+    <w:p>
+      <w:r>
+        <w:t xml:space="preserve">I found here that </w:t>
+      </w:r>
+      <w:r>
+        <w:t>the endpoint “admin” leads to a logi</w:t>
+      </w:r>
+      <w:r>
+        <w:t>n</w:t>
+      </w:r>
+      <w:r>
+        <w:t>:</w:t>
+      </w:r>
+    </w:p>
+    <w:p>
+      <w:r>
+        <w:drawing>
+          <wp:inline distT="0" distB="0" distL="0" distR="0" wp14:anchorId="20057DE7" wp14:editId="49577887">
+            <wp:extent cx="1505080" cy="704911"/>
+            <wp:effectExtent l="0" t="0" r="0" b="0"/>
+            <wp:docPr id="49514811" name="תמונה 1" descr="תמונה שמכילה טקסט, גופן, צילום מסך, עיצוב&#10;&#10;תוכן בינה מלאכותית גנרטיבית עשוי להיות שגוי."/>
+            <wp:cNvGraphicFramePr>
+              <a:graphicFrameLocks xmlns:a="http://schemas.openxmlformats.org/drawingml/2006/main" noChangeAspect="1"/>
+            </wp:cNvGraphicFramePr>
+            <a:graphic xmlns:a="http://schemas.openxmlformats.org/drawingml/2006/main">
+              <a:graphicData uri="http://schemas.openxmlformats.org/drawingml/2006/picture">
+                <pic:pic xmlns:pic="http://schemas.openxmlformats.org/drawingml/2006/picture">
+                  <pic:nvPicPr>
+                    <pic:cNvPr id="49514811" name="תמונה 1" descr="תמונה שמכילה טקסט, גופן, צילום מסך, עיצוב&#10;&#10;תוכן בינה מלאכותית גנרטיבית עשוי להיות שגוי."/>
+                    <pic:cNvPicPr/>
+                  </pic:nvPicPr>
+                  <pic:blipFill>
+                    <a:blip r:embed="rId25"/>
+                    <a:stretch>
+                      <a:fillRect/>
+                    </a:stretch>
+                  </pic:blipFill>
+                  <pic:spPr>
+                    <a:xfrm>
+                      <a:off x="0" y="0"/>
+                      <a:ext cx="1505080" cy="704911"/>
+                    </a:xfrm>
+                    <a:prstGeom prst="rect">
+                      <a:avLst/>
+                    </a:prstGeom>
+                  </pic:spPr>
+                </pic:pic>
+              </a:graphicData>
+            </a:graphic>
+          </wp:inline>
+        </w:drawing>
+      </w:r>
+    </w:p>
+    <w:p>
+      <w:r>
+        <w:t>Therefore, I wrote this</w:t>
+      </w:r>
+      <w:r>
+        <w:t xml:space="preserve"> another</w:t>
+      </w:r>
+      <w:r>
+        <w:t xml:space="preserve"> script to bruteforce </w:t>
+      </w:r>
+      <w:r>
+        <w:t>password</w:t>
+      </w:r>
+      <w:r>
+        <w:t xml:space="preserve"> from th</w:t>
+      </w:r>
+      <w:r>
+        <w:t>is</w:t>
+      </w:r>
+      <w:r>
+        <w:t xml:space="preserve"> </w:t>
+      </w:r>
+      <w:r>
+        <w:t>endpoin</w:t>
+      </w:r>
+      <w:r>
+        <w:t>t</w:t>
+      </w:r>
+      <w:r>
+        <w:t>:</w:t>
+      </w:r>
+    </w:p>
+    <w:p>
+      <w:r>
+        <w:lastRenderedPageBreak/>
+        <w:drawing>
+          <wp:inline distT="0" distB="0" distL="0" distR="0" wp14:anchorId="28528C04" wp14:editId="01D236DF">
+            <wp:extent cx="6104149" cy="4770533"/>
+            <wp:effectExtent l="0" t="0" r="0" b="0"/>
+            <wp:docPr id="612734595" name="תמונה 1"/>
+            <wp:cNvGraphicFramePr>
+              <a:graphicFrameLocks xmlns:a="http://schemas.openxmlformats.org/drawingml/2006/main" noChangeAspect="1"/>
+            </wp:cNvGraphicFramePr>
+            <a:graphic xmlns:a="http://schemas.openxmlformats.org/drawingml/2006/main">
+              <a:graphicData uri="http://schemas.openxmlformats.org/drawingml/2006/picture">
+                <pic:pic xmlns:pic="http://schemas.openxmlformats.org/drawingml/2006/picture">
+                  <pic:nvPicPr>
+                    <pic:cNvPr id="612734595" name=""/>
+                    <pic:cNvPicPr/>
+                  </pic:nvPicPr>
+                  <pic:blipFill>
+                    <a:blip r:embed="rId26"/>
+                    <a:stretch>
+                      <a:fillRect/>
+                    </a:stretch>
+                  </pic:blipFill>
+                  <pic:spPr>
+                    <a:xfrm>
+                      <a:off x="0" y="0"/>
+                      <a:ext cx="6104149" cy="4770533"/>
+                    </a:xfrm>
+                    <a:prstGeom prst="rect">
+                      <a:avLst/>
+                    </a:prstGeom>
+                  </pic:spPr>
+                </pic:pic>
+              </a:graphicData>
+            </a:graphic>
+          </wp:inline>
+        </w:drawing>
+      </w:r>
+    </w:p>
+    <w:p>
+      <w:r>
+        <w:t>And I run it:</w:t>
+      </w:r>
+    </w:p>
+    <w:p>
+      <w:r>
+        <w:drawing>
+          <wp:inline distT="0" distB="0" distL="0" distR="0" wp14:anchorId="7ADF696A" wp14:editId="67DBEE3B">
+            <wp:extent cx="3810330" cy="2667231"/>
+            <wp:effectExtent l="0" t="0" r="0" b="0"/>
+            <wp:docPr id="265351562" name="תמונה 1"/>
+            <wp:cNvGraphicFramePr>
+              <a:graphicFrameLocks xmlns:a="http://schemas.openxmlformats.org/drawingml/2006/main" noChangeAspect="1"/>
+            </wp:cNvGraphicFramePr>
+            <a:graphic xmlns:a="http://schemas.openxmlformats.org/drawingml/2006/main">
+              <a:graphicData uri="http://schemas.openxmlformats.org/drawingml/2006/picture">
+                <pic:pic xmlns:pic="http://schemas.openxmlformats.org/drawingml/2006/picture">
+                  <pic:nvPicPr>
+                    <pic:cNvPr id="265351562" name=""/>
+                    <pic:cNvPicPr/>
+                  </pic:nvPicPr>
+                  <pic:blipFill>
+                    <a:blip r:embed="rId27"/>
+                    <a:stretch>
+                      <a:fillRect/>
+                    </a:stretch>
+                  </pic:blipFill>
+                  <pic:spPr>
+                    <a:xfrm>
+                      <a:off x="0" y="0"/>
+                      <a:ext cx="3810330" cy="2667231"/>
+                    </a:xfrm>
+                    <a:prstGeom prst="rect">
+                      <a:avLst/>
+                    </a:prstGeom>
+                  </pic:spPr>
+                </pic:pic>
+              </a:graphicData>
+            </a:graphic>
+          </wp:inline>
+        </w:drawing>
+      </w:r>
+    </w:p>
+    <w:p>
+      <w:r>
+        <w:t xml:space="preserve">After couple of </w:t>
+      </w:r>
+      <w:r>
+        <w:t>passwords,</w:t>
+      </w:r>
+      <w:r>
+        <w:t xml:space="preserve"> I found the right passwords</w:t>
+      </w:r>
+      <w:r>
+        <w:t>!</w:t>
+      </w:r>
+    </w:p>
+    <w:p>
+      <w:r>
+        <w:t xml:space="preserve">I tried on the python interactive </w:t>
+      </w:r>
+      <w:r>
+        <w:t>shell,</w:t>
+      </w:r>
+      <w:r>
+        <w:t xml:space="preserve"> and </w:t>
+      </w:r>
+      <w:r>
+        <w:t>I got a root shell</w:t>
+      </w:r>
+      <w:r>
+        <w:t>:</w:t>
+      </w:r>
+    </w:p>
+    <w:p>
+      <w:r>
+        <w:drawing>
+          <wp:inline distT="0" distB="0" distL="0" distR="0" wp14:anchorId="0CEE9954" wp14:editId="387CF253">
+            <wp:extent cx="2209992" cy="704911"/>
+            <wp:effectExtent l="0" t="0" r="0" b="0"/>
+            <wp:docPr id="1022325673" name="תמונה 1"/>
+            <wp:cNvGraphicFramePr>
+              <a:graphicFrameLocks xmlns:a="http://schemas.openxmlformats.org/drawingml/2006/main" noChangeAspect="1"/>
+            </wp:cNvGraphicFramePr>
+            <a:graphic xmlns:a="http://schemas.openxmlformats.org/drawingml/2006/main">
+              <a:graphicData uri="http://schemas.openxmlformats.org/drawingml/2006/picture">
+                <pic:pic xmlns:pic="http://schemas.openxmlformats.org/drawingml/2006/picture">
+                  <pic:nvPicPr>
+                    <pic:cNvPr id="1022325673" name=""/>
+                    <pic:cNvPicPr/>
+                  </pic:nvPicPr>
+                  <pic:blipFill>
+                    <a:blip r:embed="rId28"/>
+                    <a:stretch>
+                      <a:fillRect/>
+                    </a:stretch>
+                  </pic:blipFill>
+                  <pic:spPr>
+                    <a:xfrm>
+                      <a:off x="0" y="0"/>
+                      <a:ext cx="2209992" cy="704911"/>
+                    </a:xfrm>
+                    <a:prstGeom prst="rect">
+                      <a:avLst/>
+                    </a:prstGeom>
+                  </pic:spPr>
+                </pic:pic>
+              </a:graphicData>
+            </a:graphic>
+          </wp:inline>
+        </w:drawing>
+      </w:r>
+    </w:p>
+    <w:p>
+      <w:r>
+        <w:lastRenderedPageBreak/>
+        <w:drawing>
+          <wp:inline distT="0" distB="0" distL="0" distR="0" wp14:anchorId="3C3917DB" wp14:editId="588629BE">
+            <wp:extent cx="2133785" cy="369602"/>
+            <wp:effectExtent l="0" t="0" r="0" b="0"/>
+            <wp:docPr id="527321454" name="תמונה 1" descr="תמונה שמכילה טקסט, גופן, צילום מסך&#10;&#10;תוכן בינה מלאכותית גנרטיבית עשוי להיות שגוי."/>
+            <wp:cNvGraphicFramePr>
+              <a:graphicFrameLocks xmlns:a="http://schemas.openxmlformats.org/drawingml/2006/main" noChangeAspect="1"/>
+            </wp:cNvGraphicFramePr>
+            <a:graphic xmlns:a="http://schemas.openxmlformats.org/drawingml/2006/main">
+              <a:graphicData uri="http://schemas.openxmlformats.org/drawingml/2006/picture">
+                <pic:pic xmlns:pic="http://schemas.openxmlformats.org/drawingml/2006/picture">
+                  <pic:nvPicPr>
+                    <pic:cNvPr id="527321454" name="תמונה 1" descr="תמונה שמכילה טקסט, גופן, צילום מסך&#10;&#10;תוכן בינה מלאכותית גנרטיבית עשוי להיות שגוי."/>
+                    <pic:cNvPicPr/>
+                  </pic:nvPicPr>
+                  <pic:blipFill>
+                    <a:blip r:embed="rId29"/>
+                    <a:stretch>
+                      <a:fillRect/>
+                    </a:stretch>
+                  </pic:blipFill>
+                  <pic:spPr>
+                    <a:xfrm>
+                      <a:off x="0" y="0"/>
+                      <a:ext cx="2133785" cy="369602"/>
+                    </a:xfrm>
+                    <a:prstGeom prst="rect">
+                      <a:avLst/>
+                    </a:prstGeom>
+                  </pic:spPr>
+                </pic:pic>
+              </a:graphicData>
+            </a:graphic>
+          </wp:inline>
+        </w:drawing>
+      </w:r>
+    </w:p>
+    <w:p>
+      <w:r>
+        <w:t>Then</w:t>
+      </w:r>
+      <w:r>
+        <w:t>,</w:t>
+      </w:r>
+      <w:r>
+        <w:t xml:space="preserve"> </w:t>
+      </w:r>
+      <w:r>
+        <w:t>I</w:t>
+      </w:r>
+      <w:r>
+        <w:t xml:space="preserve"> </w:t>
+      </w:r>
+      <w:r>
+        <w:t xml:space="preserve">realized that I was in the </w:t>
+      </w:r>
+      <w:r>
+        <w:t xml:space="preserve">root </w:t>
+      </w:r>
+      <w:r>
+        <w:t>directory,</w:t>
+      </w:r>
+      <w:r>
+        <w:t xml:space="preserve"> and I found there the root flag</w:t>
+      </w:r>
+      <w:r>
+        <w:t>:</w:t>
+      </w:r>
+    </w:p>
+    <w:p>
+      <w:r>
+        <w:drawing>
+          <wp:inline distT="0" distB="0" distL="0" distR="0" wp14:anchorId="7DB46F9A" wp14:editId="0E2A680D">
+            <wp:extent cx="304826" cy="369602"/>
+            <wp:effectExtent l="0" t="0" r="0" b="0"/>
+            <wp:docPr id="1991521027" name="תמונה 1"/>
+            <wp:cNvGraphicFramePr>
+              <a:graphicFrameLocks xmlns:a="http://schemas.openxmlformats.org/drawingml/2006/main" noChangeAspect="1"/>
+            </wp:cNvGraphicFramePr>
+            <a:graphic xmlns:a="http://schemas.openxmlformats.org/drawingml/2006/main">
+              <a:graphicData uri="http://schemas.openxmlformats.org/drawingml/2006/picture">
+                <pic:pic xmlns:pic="http://schemas.openxmlformats.org/drawingml/2006/picture">
+                  <pic:nvPicPr>
+                    <pic:cNvPr id="1991521027" name=""/>
+                    <pic:cNvPicPr/>
+                  </pic:nvPicPr>
+                  <pic:blipFill>
+                    <a:blip r:embed="rId30"/>
+                    <a:stretch>
+                      <a:fillRect/>
+                    </a:stretch>
+                  </pic:blipFill>
+                  <pic:spPr>
+                    <a:xfrm>
+                      <a:off x="0" y="0"/>
+                      <a:ext cx="304826" cy="369602"/>
+                    </a:xfrm>
+                    <a:prstGeom prst="rect">
+                      <a:avLst/>
+                    </a:prstGeom>
+                  </pic:spPr>
+                </pic:pic>
+              </a:graphicData>
+            </a:graphic>
+          </wp:inline>
+        </w:drawing>
+      </w:r>
+    </w:p>
+    <w:p>
+      <w:r>
+        <w:drawing>
+          <wp:inline distT="0" distB="0" distL="0" distR="0" wp14:anchorId="6257164C" wp14:editId="23C1A39C">
+            <wp:extent cx="1809907" cy="666808"/>
+            <wp:effectExtent l="0" t="0" r="0" b="0"/>
+            <wp:docPr id="577655966" name="תמונה 1" descr="תמונה שמכילה טקסט, גופן, צילום מסך&#10;&#10;תוכן בינה מלאכותית גנרטיבית עשוי להיות שגוי."/>
+            <wp:cNvGraphicFramePr>
+              <a:graphicFrameLocks xmlns:a="http://schemas.openxmlformats.org/drawingml/2006/main" noChangeAspect="1"/>
+            </wp:cNvGraphicFramePr>
+            <a:graphic xmlns:a="http://schemas.openxmlformats.org/drawingml/2006/main">
+              <a:graphicData uri="http://schemas.openxmlformats.org/drawingml/2006/picture">
+                <pic:pic xmlns:pic="http://schemas.openxmlformats.org/drawingml/2006/picture">
+                  <pic:nvPicPr>
+                    <pic:cNvPr id="577655966" name="תמונה 1" descr="תמונה שמכילה טקסט, גופן, צילום מסך&#10;&#10;תוכן בינה מלאכותית גנרטיבית עשוי להיות שגוי."/>
+                    <pic:cNvPicPr/>
+                  </pic:nvPicPr>
+                  <pic:blipFill>
+                    <a:blip r:embed="rId31"/>
+                    <a:stretch>
+                      <a:fillRect/>
+                    </a:stretch>
+                  </pic:blipFill>
+                  <pic:spPr>
+                    <a:xfrm>
+                      <a:off x="0" y="0"/>
+                      <a:ext cx="1809907" cy="666808"/>
+                    </a:xfrm>
+                    <a:prstGeom prst="rect">
+                      <a:avLst/>
+                    </a:prstGeom>
+                  </pic:spPr>
+                </pic:pic>
+              </a:graphicData>
+            </a:graphic>
+          </wp:inline>
+        </w:drawing>
+      </w:r>
+    </w:p>
+    <w:p/>
     <w:sectPr>
       <w:pgSz w:w="12240" w:h="15840"/>
       <w:pgMar w:top="170" w:right="170" w:bottom="170" w:left="170" w:header="720" w:footer="720" w:gutter="0"/>
@@ -1959,7 +2534,6 @@
   <w:style w:type="character" w:default="1" w:styleId="a0">
     <w:name w:val="Default Paragraph Font"/>
     <w:uiPriority w:val="1"/>
-    <w:semiHidden/>
     <w:unhideWhenUsed/>
   </w:style>
   <w:style w:type="table" w:default="1" w:styleId="a1">

</xml_diff>